<commit_message>
feat(books): embed manager signature on General Book approval
The General Book template had no {{ manager_sig }} token and its post-process
deliberately skips signature embedding, so signing a General Book left no
signature on the document — only the printed signer name/title block.

Add a centered {{ manager_sig }} token in the empty line directly above
{{ manager_name }} (single run so docxtpl parses it). The signing path already
populates manager_sig_path for General Book (_adapt_general_book -> _adapt_common
renames sig1_path), so the signer's signature now renders above their name on
approval. Unsigned/draft generation renders the token empty (no slot artifact),
matching every other form.

Verified: rendered a signed General Book — signature lands centered above the
name, body and subject render unchanged.

Co-Authored-By: Claude Opus 4.8 (1M context) <noreply@anthropic.com>
</commit_message>
<xml_diff>
--- a/backend/templates/GSSG-GS_300-003_General_Book.docx
+++ b/backend/templates/GSSG-GS_300-003_General_Book.docx
@@ -356,6 +356,25 @@
           <w:lang w:bidi="ar-AE"/>
         </w:rPr>
       </w:pPr>
+    </w:p>
+    <w:p>
+      <w:pPr>
+        <w:bidi/>
+        <w:ind w:left="6480"/>
+        <w:jc w:val="center"/>
+        <w:rPr>
+          <w:rFonts w:cstheme="minorHAnsi"/>
+          <w:b/>
+          <w:bCs/>
+          <w:sz w:val="28"/>
+          <w:szCs w:val="28"/>
+          <w:rtl/>
+          <w:lang w:bidi="ar-AE"/>
+        </w:rPr>
+      </w:pPr>
+      <w:r>
+        <w:t>{{ manager_sig }}</w:t>
+      </w:r>
     </w:p>
     <w:p>
       <w:pPr>

</xml_diff>

<commit_message>
feat(general-book): Arabic ref line above date in canonical template
Add `{%p if ref %}` / `الرقم: {{ ref }}` / `{%p endif %}` guard above
the date line in GSSG-GS_300-003_General_Book.docx via idempotent
script. Ref run carries `<w:rtl w:val="0"/>` so 1/5/GSSG/NNN stays LTR
inside the RTL paragraph.

Co-Authored-By: Claude Fable 5 <noreply@anthropic.com>
Claude-Session: https://claude.ai/code/session_01FEw8UYNvx5VqA3U9EsxY5H
</commit_message>
<xml_diff>
--- a/backend/templates/GSSG-GS_300-003_General_Book.docx
+++ b/backend/templates/GSSG-GS_300-003_General_Book.docx
@@ -2,6 +2,67 @@
 <file path=word/document.xml><?xml version="1.0" encoding="utf-8"?>
 <w:document xmlns:wpc="http://schemas.microsoft.com/office/word/2010/wordprocessingCanvas" xmlns:cx="http://schemas.microsoft.com/office/drawing/2014/chartex" xmlns:cx1="http://schemas.microsoft.com/office/drawing/2015/9/8/chartex" xmlns:cx2="http://schemas.microsoft.com/office/drawing/2015/10/21/chartex" xmlns:cx3="http://schemas.microsoft.com/office/drawing/2016/5/9/chartex" xmlns:cx4="http://schemas.microsoft.com/office/drawing/2016/5/10/chartex" xmlns:cx5="http://schemas.microsoft.com/office/drawing/2016/5/11/chartex" xmlns:cx6="http://schemas.microsoft.com/office/drawing/2016/5/12/chartex" xmlns:cx7="http://schemas.microsoft.com/office/drawing/2016/5/13/chartex" xmlns:cx8="http://schemas.microsoft.com/office/drawing/2016/5/14/chartex" xmlns:mc="http://schemas.openxmlformats.org/markup-compatibility/2006" xmlns:aink="http://schemas.microsoft.com/office/drawing/2016/ink" xmlns:am3d="http://schemas.microsoft.com/office/drawing/2017/model3d" xmlns:o="urn:schemas-microsoft-com:office:office" xmlns:oel="http://schemas.microsoft.com/office/2019/extlst" xmlns:r="http://schemas.openxmlformats.org/officeDocument/2006/relationships" xmlns:m="http://schemas.openxmlformats.org/officeDocument/2006/math" xmlns:v="urn:schemas-microsoft-com:vml" xmlns:wp14="http://schemas.microsoft.com/office/word/2010/wordprocessingDrawing" xmlns:wp="http://schemas.openxmlformats.org/drawingml/2006/wordprocessingDrawing" xmlns:w10="urn:schemas-microsoft-com:office:word" xmlns:w="http://schemas.openxmlformats.org/wordprocessingml/2006/main" xmlns:w14="http://schemas.microsoft.com/office/word/2010/wordml" xmlns:w15="http://schemas.microsoft.com/office/word/2012/wordml" xmlns:w16cex="http://schemas.microsoft.com/office/word/2018/wordml/cex" xmlns:w16cid="http://schemas.microsoft.com/office/word/2016/wordml/cid" xmlns:w16="http://schemas.microsoft.com/office/word/2018/wordml" xmlns:w16du="http://schemas.microsoft.com/office/word/2023/wordml/word16du" xmlns:w16sdtdh="http://schemas.microsoft.com/office/word/2020/wordml/sdtdatahash" xmlns:w16sdtfl="http://schemas.microsoft.com/office/word/2024/wordml/sdtformatlock" xmlns:w16se="http://schemas.microsoft.com/office/word/2015/wordml/symex" xmlns:wpg="http://schemas.microsoft.com/office/word/2010/wordprocessingGroup" xmlns:wpi="http://schemas.microsoft.com/office/word/2010/wordprocessingInk" xmlns:wne="http://schemas.microsoft.com/office/word/2006/wordml" xmlns:wps="http://schemas.microsoft.com/office/word/2010/wordprocessingShape" mc:Ignorable="w14 w15 w16se w16cid w16 w16cex w16sdtdh w16sdtfl w16du wp14">
   <w:body>
+    <w:p>
+      <w:pPr>
+        <w:bidi/>
+        <w:rPr>
+          <w:rFonts w:cstheme="minorHAnsi"/>
+          <w:i/>
+          <w:iCs/>
+          <w:sz w:val="32"/>
+          <w:szCs w:val="32"/>
+          <w:rtl/>
+          <w:lang w:bidi="ar-AE"/>
+        </w:rPr>
+      </w:pPr>
+      <w:r>
+        <w:t>{%p if ref %}</w:t>
+      </w:r>
+    </w:p>
+    <w:p>
+      <w:pPr>
+        <w:bidi/>
+        <w:rPr>
+          <w:rFonts w:cstheme="minorHAnsi"/>
+          <w:i/>
+          <w:iCs/>
+          <w:sz w:val="32"/>
+          <w:szCs w:val="32"/>
+          <w:rtl/>
+          <w:lang w:bidi="ar-AE"/>
+        </w:rPr>
+      </w:pPr>
+      <w:r>
+        <w:rPr>
+          <w:sz w:val="32"/>
+        </w:rPr>
+        <w:t xml:space="preserve">الرقم: </w:t>
+      </w:r>
+      <w:r>
+        <w:rPr>
+          <w:sz w:val="32"/>
+          <w:rtl w:val="0"/>
+        </w:rPr>
+        <w:t>{{ ref }}</w:t>
+      </w:r>
+    </w:p>
+    <w:p>
+      <w:pPr>
+        <w:bidi/>
+        <w:rPr>
+          <w:rFonts w:cstheme="minorHAnsi"/>
+          <w:i/>
+          <w:iCs/>
+          <w:sz w:val="32"/>
+          <w:szCs w:val="32"/>
+          <w:rtl/>
+          <w:lang w:bidi="ar-AE"/>
+        </w:rPr>
+      </w:pPr>
+      <w:r>
+        <w:t>{%p endif %}</w:t>
+      </w:r>
+    </w:p>
     <w:p>
       <w:pPr>
         <w:bidi/>

</xml_diff>

<commit_message>
fix: preserve General Book template formatting (#61)
</commit_message>
<xml_diff>
--- a/backend/templates/GSSG-GS_300-003_General_Book.docx
+++ b/backend/templates/GSSG-GS_300-003_General_Book.docx
@@ -6,16 +6,19 @@
       <w:pPr>
         <w:bidi/>
         <w:rPr>
-          <w:rFonts w:cstheme="minorHAnsi"/>
-          <w:i/>
-          <w:iCs/>
-          <w:sz w:val="32"/>
-          <w:szCs w:val="32"/>
+          <w:rFonts w:asciiTheme="majorHAnsi" w:hAnsiTheme="majorHAnsi" w:cstheme="majorHAnsi"/>
+          <w:sz w:val="20"/>
+          <w:szCs w:val="20"/>
           <w:rtl/>
           <w:lang w:bidi="ar-AE"/>
         </w:rPr>
       </w:pPr>
       <w:r>
+        <w:rPr>
+          <w:rFonts w:asciiTheme="majorHAnsi" w:hAnsiTheme="majorHAnsi" w:cstheme="majorHAnsi"/>
+          <w:sz w:val="20"/>
+          <w:szCs w:val="20"/>
+        </w:rPr>
         <w:t>{%p if ref %}</w:t>
       </w:r>
     </w:p>
@@ -23,43 +26,59 @@
       <w:pPr>
         <w:bidi/>
         <w:rPr>
-          <w:rFonts w:cstheme="minorHAnsi"/>
-          <w:i/>
-          <w:iCs/>
-          <w:sz w:val="32"/>
-          <w:szCs w:val="32"/>
+          <w:rFonts w:asciiTheme="majorHAnsi" w:hAnsiTheme="majorHAnsi" w:cstheme="majorHAnsi"/>
+          <w:sz w:val="20"/>
+          <w:szCs w:val="20"/>
           <w:rtl/>
           <w:lang w:bidi="ar-AE"/>
         </w:rPr>
       </w:pPr>
       <w:r>
         <w:rPr>
-          <w:sz w:val="32"/>
+          <w:rFonts w:asciiTheme="majorHAnsi" w:hAnsiTheme="majorHAnsi" w:cstheme="majorHAnsi"/>
+          <w:sz w:val="20"/>
+          <w:szCs w:val="20"/>
         </w:rPr>
         <w:t xml:space="preserve">الرقم: </w:t>
       </w:r>
+      <w:proofErr w:type="gramStart"/>
       <w:r>
         <w:rPr>
-          <w:sz w:val="32"/>
+          <w:rFonts w:asciiTheme="majorHAnsi" w:hAnsiTheme="majorHAnsi" w:cstheme="majorHAnsi"/>
+          <w:sz w:val="20"/>
+          <w:szCs w:val="20"/>
           <w:rtl/>
         </w:rPr>
-        <w:t>{{ ref }}</w:t>
+        <w:t>{{ ref</w:t>
+      </w:r>
+      <w:proofErr w:type="gramEnd"/>
+      <w:r>
+        <w:rPr>
+          <w:rFonts w:asciiTheme="majorHAnsi" w:hAnsiTheme="majorHAnsi" w:cstheme="majorHAnsi"/>
+          <w:sz w:val="20"/>
+          <w:szCs w:val="20"/>
+          <w:rtl/>
+        </w:rPr>
+        <w:t xml:space="preserve"> }}</w:t>
       </w:r>
     </w:p>
     <w:p>
       <w:pPr>
         <w:bidi/>
         <w:rPr>
-          <w:rFonts w:cstheme="minorHAnsi"/>
-          <w:i/>
-          <w:iCs/>
-          <w:sz w:val="32"/>
-          <w:szCs w:val="32"/>
+          <w:rFonts w:asciiTheme="majorHAnsi" w:hAnsiTheme="majorHAnsi" w:cstheme="majorHAnsi"/>
+          <w:sz w:val="20"/>
+          <w:szCs w:val="20"/>
           <w:rtl/>
           <w:lang w:bidi="ar-AE"/>
         </w:rPr>
       </w:pPr>
       <w:r>
+        <w:rPr>
+          <w:rFonts w:asciiTheme="majorHAnsi" w:hAnsiTheme="majorHAnsi" w:cstheme="majorHAnsi"/>
+          <w:sz w:val="20"/>
+          <w:szCs w:val="20"/>
+        </w:rPr>
         <w:t>{%p endif %}</w:t>
       </w:r>
     </w:p>
@@ -67,26 +86,44 @@
       <w:pPr>
         <w:bidi/>
         <w:rPr>
-          <w:rFonts w:cstheme="minorHAnsi"/>
-          <w:i/>
-          <w:iCs/>
-          <w:sz w:val="32"/>
-          <w:szCs w:val="32"/>
+          <w:rFonts w:asciiTheme="majorHAnsi" w:hAnsiTheme="majorHAnsi" w:cstheme="majorHAnsi"/>
+          <w:sz w:val="20"/>
+          <w:szCs w:val="20"/>
           <w:rtl/>
           <w:lang w:bidi="ar-AE"/>
         </w:rPr>
       </w:pPr>
       <w:r>
         <w:rPr>
-          <w:rFonts w:cstheme="minorHAnsi" w:hint="cs"/>
-          <w:i/>
-          <w:iCs/>
-          <w:sz w:val="32"/>
-          <w:szCs w:val="32"/>
+          <w:rFonts w:asciiTheme="majorHAnsi" w:hAnsiTheme="majorHAnsi" w:cstheme="majorHAnsi"/>
+          <w:sz w:val="20"/>
+          <w:szCs w:val="20"/>
           <w:rtl/>
           <w:lang w:bidi="ar-AE"/>
         </w:rPr>
-        <w:t>التاريخ: {{ date }}</w:t>
+        <w:t xml:space="preserve">التاريخ: </w:t>
+      </w:r>
+      <w:proofErr w:type="gramStart"/>
+      <w:r>
+        <w:rPr>
+          <w:rFonts w:asciiTheme="majorHAnsi" w:hAnsiTheme="majorHAnsi" w:cstheme="majorHAnsi"/>
+          <w:sz w:val="20"/>
+          <w:szCs w:val="20"/>
+          <w:rtl/>
+          <w:lang w:bidi="ar-AE"/>
+        </w:rPr>
+        <w:t>{{ date</w:t>
+      </w:r>
+      <w:proofErr w:type="gramEnd"/>
+      <w:r>
+        <w:rPr>
+          <w:rFonts w:asciiTheme="majorHAnsi" w:hAnsiTheme="majorHAnsi" w:cstheme="majorHAnsi"/>
+          <w:sz w:val="20"/>
+          <w:szCs w:val="20"/>
+          <w:rtl/>
+          <w:lang w:bidi="ar-AE"/>
+        </w:rPr>
+        <w:t xml:space="preserve"> }}</w:t>
       </w:r>
     </w:p>
     <w:p>
@@ -114,6 +151,7 @@
         </w:rPr>
         <w:t xml:space="preserve">السيد \ </w:t>
       </w:r>
+      <w:proofErr w:type="gramStart"/>
       <w:r>
         <w:rPr>
           <w:rFonts w:cstheme="minorHAnsi" w:hint="cs"/>
@@ -124,8 +162,9 @@
           <w:rtl/>
           <w:lang w:bidi="ar-AE"/>
         </w:rPr>
-        <w:t>{{ recipient_name }}</w:t>
+        <w:t>{{ recipient</w:t>
       </w:r>
+      <w:proofErr w:type="gramEnd"/>
       <w:r>
         <w:rPr>
           <w:rFonts w:cstheme="minorHAnsi" w:hint="cs"/>
@@ -136,6 +175,44 @@
           <w:rtl/>
           <w:lang w:bidi="ar-AE"/>
         </w:rPr>
+        <w:t>_</w:t>
+      </w:r>
+      <w:proofErr w:type="gramStart"/>
+      <w:r>
+        <w:rPr>
+          <w:rFonts w:cstheme="minorHAnsi" w:hint="cs"/>
+          <w:b/>
+          <w:bCs/>
+          <w:sz w:val="32"/>
+          <w:szCs w:val="32"/>
+          <w:rtl/>
+          <w:lang w:bidi="ar-AE"/>
+        </w:rPr>
+        <w:t>name }</w:t>
+      </w:r>
+      <w:proofErr w:type="gramEnd"/>
+      <w:r>
+        <w:rPr>
+          <w:rFonts w:cstheme="minorHAnsi" w:hint="cs"/>
+          <w:b/>
+          <w:bCs/>
+          <w:sz w:val="32"/>
+          <w:szCs w:val="32"/>
+          <w:rtl/>
+          <w:lang w:bidi="ar-AE"/>
+        </w:rPr>
+        <w:t>}</w:t>
+      </w:r>
+      <w:r>
+        <w:rPr>
+          <w:rFonts w:cstheme="minorHAnsi" w:hint="cs"/>
+          <w:b/>
+          <w:bCs/>
+          <w:sz w:val="32"/>
+          <w:szCs w:val="32"/>
+          <w:rtl/>
+          <w:lang w:bidi="ar-AE"/>
+        </w:rPr>
         <w:t xml:space="preserve"> المحترم </w:t>
       </w:r>
     </w:p>
@@ -229,6 +306,7 @@
           <w:lang w:bidi="ar-AE"/>
         </w:rPr>
       </w:pPr>
+      <w:proofErr w:type="gramStart"/>
       <w:r>
         <w:rPr>
           <w:rFonts w:cstheme="minorHAnsi" w:hint="cs"/>
@@ -240,7 +318,49 @@
           <w:rtl/>
           <w:lang w:bidi="ar-AE"/>
         </w:rPr>
-        <w:t>{{ '' if not subject else 'الموضوع: ' ~ subject }}</w:t>
+        <w:t>{{ '</w:t>
+      </w:r>
+      <w:proofErr w:type="gramEnd"/>
+      <w:r>
+        <w:rPr>
+          <w:rFonts w:cstheme="minorHAnsi" w:hint="cs"/>
+          <w:b/>
+          <w:bCs/>
+          <w:sz w:val="32"/>
+          <w:szCs w:val="32"/>
+          <w:u w:val="single"/>
+          <w:rtl/>
+          <w:lang w:bidi="ar-AE"/>
+        </w:rPr>
+        <w:t xml:space="preserve">' if not subject else 'الموضوع: ' ~ </w:t>
+      </w:r>
+      <w:proofErr w:type="gramStart"/>
+      <w:r>
+        <w:rPr>
+          <w:rFonts w:cstheme="minorHAnsi" w:hint="cs"/>
+          <w:b/>
+          <w:bCs/>
+          <w:sz w:val="32"/>
+          <w:szCs w:val="32"/>
+          <w:u w:val="single"/>
+          <w:rtl/>
+          <w:lang w:bidi="ar-AE"/>
+        </w:rPr>
+        <w:t>subject }</w:t>
+      </w:r>
+      <w:proofErr w:type="gramEnd"/>
+      <w:r>
+        <w:rPr>
+          <w:rFonts w:cstheme="minorHAnsi" w:hint="cs"/>
+          <w:b/>
+          <w:bCs/>
+          <w:sz w:val="32"/>
+          <w:szCs w:val="32"/>
+          <w:u w:val="single"/>
+          <w:rtl/>
+          <w:lang w:bidi="ar-AE"/>
+        </w:rPr>
+        <w:t>}</w:t>
       </w:r>
     </w:p>
     <w:p>
@@ -270,6 +390,8 @@
           <w:lang w:bidi="ar-AE"/>
         </w:rPr>
       </w:pPr>
+      <w:proofErr w:type="gramStart"/>
+      <w:proofErr w:type="gramEnd"/>
       <w:r>
         <w:rPr>
           <w:rFonts w:cstheme="minorHAnsi" w:hint="cs"/>
@@ -280,7 +402,7 @@
           <w:rtl/>
           <w:lang w:bidi="ar-AE"/>
         </w:rPr>
-        <w:t>{{ body }}</w:t>
+        <w:t>يطيب لنا أن نتقدم لكم بأطيب التحيات والتقدير، ننوه على الموضوع أعلاه انه</w:t>
       </w:r>
     </w:p>
     <w:p>
@@ -297,6 +419,18 @@
           <w:lang w:bidi="ar-AE"/>
         </w:rPr>
       </w:pPr>
+      <w:r>
+        <w:rPr>
+          <w:rFonts w:cstheme="minorHAnsi" w:hint="cs"/>
+          <w:b/>
+          <w:bCs/>
+          <w:sz w:val="28"/>
+          <w:szCs w:val="28"/>
+          <w:rtl/>
+          <w:lang w:bidi="ar-AE"/>
+        </w:rPr>
+        <w:t>{{ body }}</w:t>
+      </w:r>
     </w:p>
     <w:p>
       <w:pPr>
@@ -1083,17 +1217,7 @@
               <w:sz w:val="18"/>
               <w:szCs w:val="18"/>
             </w:rPr>
-            <w:t xml:space="preserve">{{ </w:t>
-          </w:r>
-          <w:proofErr w:type="spellStart"/>
-          <w:r>
-            <w:rPr>
-              <w:rFonts w:ascii="Helvetica" w:hAnsi="Helvetica"/>
-              <w:color w:val="FFFFFF" w:themeColor="background1"/>
-              <w:sz w:val="18"/>
-              <w:szCs w:val="18"/>
-            </w:rPr>
-            <w:t>submitter</w:t>
+            <w:t>{{ submitter</w:t>
           </w:r>
           <w:proofErr w:type="gramEnd"/>
           <w:r>
@@ -1103,17 +1227,7 @@
               <w:sz w:val="18"/>
               <w:szCs w:val="18"/>
             </w:rPr>
-            <w:t>_g</w:t>
-          </w:r>
-          <w:proofErr w:type="spellEnd"/>
-          <w:r>
-            <w:rPr>
-              <w:rFonts w:ascii="Helvetica" w:hAnsi="Helvetica"/>
-              <w:color w:val="FFFFFF" w:themeColor="background1"/>
-              <w:sz w:val="18"/>
-              <w:szCs w:val="18"/>
-            </w:rPr>
-            <w:t xml:space="preserve"> }}</w:t>
+            <w:t>_g }}</w:t>
           </w:r>
         </w:p>
       </w:tc>

</xml_diff>